<commit_message>
SOP header: ELDA Lead Systems Withdrawal SOP hero, WO Adventure Race sub
Hero title "ELDA Lead Systems Withdrawal SOP" with subordinate
"Warrant Officers Adventure Race" above the Army Red rule; footer
title updated to match.

Co-Authored-By: Claude Fable 5 <noreply@anthropic.com>
Claude-Session: https://claude.ai/code/session_01YLo1WfwUDkbwfJEF3ZNVbB
</commit_message>
<xml_diff>
--- a/output/withdrawal-sop.docx
+++ b/output/withdrawal-sop.docx
@@ -52,20 +52,36 @@
     <w:p>
       <w:pPr>
         <w:pStyle w:val="Normal"/>
+        <w:spacing w:before="0" w:after="20"/>
+        <w:rPr/>
+      </w:pPr>
+      <w:r>
+        <w:rPr>
+          <w:rFonts w:cs="Arial" w:ascii="Arial" w:hAnsi="Arial"/>
+          <w:b/>
+          <w:color w:val="000000"/>
+          <w:sz w:val="40"/>
+        </w:rPr>
+        <w:t>ELDA Lead Systems Withdrawal SOP</w:t>
+      </w:r>
+    </w:p>
+    <w:p>
+      <w:pPr>
+        <w:pStyle w:val="Normal"/>
         <w:pBdr>
           <w:bottom w:val="single" w:sz="18" w:space="8" w:color="C62026"/>
         </w:pBdr>
-        <w:spacing w:before="0" w:after="40"/>
-        <w:rPr/>
-      </w:pPr>
-      <w:r>
-        <w:rPr>
-          <w:rFonts w:cs="Arial" w:ascii="Arial" w:hAnsi="Arial"/>
-          <w:b/>
-          <w:color w:val="000000"/>
-          <w:sz w:val="38"/>
-        </w:rPr>
-        <w:t>Warrant Officer Adventure Race — Participant Withdrawal SOP</w:t>
+        <w:spacing w:before="0" w:after="80"/>
+        <w:rPr/>
+      </w:pPr>
+      <w:r>
+        <w:rPr>
+          <w:rFonts w:cs="Arial" w:ascii="Arial" w:hAnsi="Arial"/>
+          <w:b/>
+          <w:color w:val="002516"/>
+          <w:sz w:val="24"/>
+        </w:rPr>
+        <w:t>Warrant Officers Adventure Race</w:t>
       </w:r>
     </w:p>
     <w:p>
@@ -1096,7 +1112,7 @@
         <w:color w:val="000000"/>
         <w:sz w:val="17"/>
       </w:rPr>
-      <w:t>Participant Withdrawal SOP</w:t>
+      <w:t>ELDA Lead Systems Withdrawal SOP</w:t>
       <w:tab/>
       <w:t>ACS 2026</w:t>
       <w:tab/>
@@ -1220,7 +1236,7 @@
         <w:color w:val="000000"/>
         <w:sz w:val="17"/>
       </w:rPr>
-      <w:t>Participant Withdrawal SOP</w:t>
+      <w:t>ELDA Lead Systems Withdrawal SOP</w:t>
       <w:tab/>
       <w:t>ACS 2026</w:t>
       <w:tab/>

</xml_diff>

<commit_message>
Retitle: ELDA Lead Systems Student Withdrawal SOP
Co-Authored-By: Claude Fable 5 <noreply@anthropic.com>
Claude-Session: https://claude.ai/code/session_01YLo1WfwUDkbwfJEF3ZNVbB
</commit_message>
<xml_diff>
--- a/output/withdrawal-sop.docx
+++ b/output/withdrawal-sop.docx
@@ -62,7 +62,7 @@
           <w:color w:val="000000"/>
           <w:sz w:val="40"/>
         </w:rPr>
-        <w:t>ELDA Lead Systems Withdrawal SOP</w:t>
+        <w:t>ELDA Lead Systems Student Withdrawal SOP</w:t>
       </w:r>
     </w:p>
     <w:p>
@@ -1112,7 +1112,7 @@
         <w:color w:val="000000"/>
         <w:sz w:val="17"/>
       </w:rPr>
-      <w:t>ELDA Lead Systems Withdrawal SOP</w:t>
+      <w:t>ELDA Lead Systems Student Withdrawal SOP</w:t>
       <w:tab/>
       <w:t>ACS 2026</w:t>
       <w:tab/>
@@ -1236,7 +1236,7 @@
         <w:color w:val="000000"/>
         <w:sz w:val="17"/>
       </w:rPr>
-      <w:t>ELDA Lead Systems Withdrawal SOP</w:t>
+      <w:t>ELDA Lead Systems Student Withdrawal SOP</w:t>
       <w:tab/>
       <w:t>ACS 2026</w:t>
       <w:tab/>

</xml_diff>

<commit_message>
Remove em-dashes from withdrawal SOP
Bold-lead list items now use sentence style (bold lead, full stop);
the withdrawal test em-dash becomes a comma; md title aligned with the
document title.

Co-Authored-By: Claude Fable 5 <noreply@anthropic.com>
Claude-Session: https://claude.ai/code/session_01YLo1WfwUDkbwfJEF3ZNVbB
</commit_message>
<xml_diff>
--- a/output/withdrawal-sop.docx
+++ b/output/withdrawal-sop.docx
@@ -390,15 +390,15 @@
           <w:b/>
           <w:i w:val="false"/>
         </w:rPr>
-        <w:t>Safety or medical risk</w:t>
-      </w:r>
-      <w:r>
-        <w:rPr>
-          <w:rFonts w:cs="Book Antiqua"/>
-          <w:b w:val="false"/>
-          <w:i w:val="false"/>
-        </w:rPr>
-        <w:t xml:space="preserve"> — continued participation is unsafe or breaches an authorised medical restriction.</w:t>
+        <w:t>Safety or medical risk.</w:t>
+      </w:r>
+      <w:r>
+        <w:rPr>
+          <w:rFonts w:cs="Book Antiqua"/>
+          <w:b w:val="false"/>
+          <w:i w:val="false"/>
+        </w:rPr>
+        <w:t xml:space="preserve"> Continued participation is unsafe or breaches an authorised medical restriction.</w:t>
       </w:r>
     </w:p>
     <w:p>
@@ -426,15 +426,15 @@
           <w:b/>
           <w:i w:val="false"/>
         </w:rPr>
-        <w:t>Physical participation</w:t>
-      </w:r>
-      <w:r>
-        <w:rPr>
-          <w:rFonts w:cs="Book Antiqua"/>
-          <w:b w:val="false"/>
-          <w:i w:val="false"/>
-        </w:rPr>
-        <w:t xml:space="preserve"> — the participant cannot safely undertake sufficient required activity despite reasonable adaptation.</w:t>
+        <w:t>Physical participation.</w:t>
+      </w:r>
+      <w:r>
+        <w:rPr>
+          <w:rFonts w:cs="Book Antiqua"/>
+          <w:b w:val="false"/>
+          <w:i w:val="false"/>
+        </w:rPr>
+        <w:t xml:space="preserve"> The participant cannot safely undertake sufficient required activity despite reasonable adaptation.</w:t>
       </w:r>
     </w:p>
     <w:p>
@@ -462,15 +462,15 @@
           <w:b/>
           <w:i w:val="false"/>
         </w:rPr>
-        <w:t>Learning and assessment validity</w:t>
-      </w:r>
-      <w:r>
-        <w:rPr>
-          <w:rFonts w:cs="Book Antiqua"/>
-          <w:b w:val="false"/>
-          <w:i w:val="false"/>
-        </w:rPr>
-        <w:t xml:space="preserve"> — the participant can no longer be meaningfully exposed to, develop against, or be assessed against approved objectives.</w:t>
+        <w:t>Learning and assessment validity.</w:t>
+      </w:r>
+      <w:r>
+        <w:rPr>
+          <w:rFonts w:cs="Book Antiqua"/>
+          <w:b w:val="false"/>
+          <w:i w:val="false"/>
+        </w:rPr>
+        <w:t xml:space="preserve"> The participant can no longer be meaningfully exposed to, develop against, or be assessed against approved objectives.</w:t>
       </w:r>
     </w:p>
     <w:p>
@@ -498,15 +498,15 @@
           <w:b/>
           <w:i w:val="false"/>
         </w:rPr>
-        <w:t>Conduct</w:t>
-      </w:r>
-      <w:r>
-        <w:rPr>
-          <w:rFonts w:cs="Book Antiqua"/>
-          <w:b w:val="false"/>
-          <w:i w:val="false"/>
-        </w:rPr>
-        <w:t xml:space="preserve"> — repeated refusal, deliberate non-compliance, or behaviour that creates risk or prevents team functioning after feedback.</w:t>
+        <w:t>Conduct.</w:t>
+      </w:r>
+      <w:r>
+        <w:rPr>
+          <w:rFonts w:cs="Book Antiqua"/>
+          <w:b w:val="false"/>
+          <w:i w:val="false"/>
+        </w:rPr>
+        <w:t xml:space="preserve"> Repeated refusal, deliberate non-compliance, or behaviour that creates risk or prevents team functioning after feedback.</w:t>
       </w:r>
     </w:p>
     <w:p>
@@ -534,15 +534,15 @@
           <w:b/>
           <w:i w:val="false"/>
         </w:rPr>
-        <w:t>Developmental welfare</w:t>
-      </w:r>
-      <w:r>
-        <w:rPr>
-          <w:rFonts w:cs="Book Antiqua"/>
-          <w:b w:val="false"/>
-          <w:i w:val="false"/>
-        </w:rPr>
-        <w:t xml:space="preserve"> — continued participation is likely to cause harm and no longer provides meaningful developmental benefit.</w:t>
+        <w:t>Developmental welfare.</w:t>
+      </w:r>
+      <w:r>
+        <w:rPr>
+          <w:rFonts w:cs="Book Antiqua"/>
+          <w:b w:val="false"/>
+          <w:i w:val="false"/>
+        </w:rPr>
+        <w:t xml:space="preserve"> Continued participation is likely to cause harm and no longer provides meaningful developmental benefit.</w:t>
       </w:r>
     </w:p>
     <w:p>
@@ -614,7 +614,7 @@
           <w:b/>
           <w:i w:val="false"/>
         </w:rPr>
-        <w:t>What specific safety requirement, required activity, or approved learning or assessment objective can no longer be safely or meaningfully achieved — and what evidence shows that reasonable coaching, team adaptation or authorised adjustment will not restore the necessary conditions?</w:t>
+        <w:t>What specific safety requirement, required activity, or approved learning or assessment objective can no longer be safely or meaningfully achieved, and what evidence shows that reasonable coaching, team adaptation or authorised adjustment will not restore the necessary conditions?</w:t>
       </w:r>
     </w:p>
     <w:p>
@@ -675,15 +675,15 @@
           <w:b/>
           <w:i w:val="false"/>
         </w:rPr>
-        <w:t>Observe and enable</w:t>
-      </w:r>
-      <w:r>
-        <w:rPr>
-          <w:rFonts w:cs="Book Antiqua"/>
-          <w:b w:val="false"/>
-          <w:i w:val="false"/>
-        </w:rPr>
-        <w:t xml:space="preserve"> — identify the issue; allow the team a reasonable opportunity to recognise, respond and manage it.</w:t>
+        <w:t>Observe and enable.</w:t>
+      </w:r>
+      <w:r>
+        <w:rPr>
+          <w:rFonts w:cs="Book Antiqua"/>
+          <w:b w:val="false"/>
+          <w:i w:val="false"/>
+        </w:rPr>
+        <w:t xml:space="preserve"> Identify the issue; allow the team a reasonable opportunity to recognise, respond and manage it.</w:t>
       </w:r>
     </w:p>
     <w:p>
@@ -711,15 +711,15 @@
           <w:b/>
           <w:i w:val="false"/>
         </w:rPr>
-        <w:t>Intervene and reassess</w:t>
-      </w:r>
-      <w:r>
-        <w:rPr>
-          <w:rFonts w:cs="Book Antiqua"/>
-          <w:b w:val="false"/>
-          <w:i w:val="false"/>
-        </w:rPr>
-        <w:t xml:space="preserve"> — provide clear feedback; apply authorised adjustments; reassess whether safe and meaningful participation remains achievable.</w:t>
+        <w:t>Intervene and reassess.</w:t>
+      </w:r>
+      <w:r>
+        <w:rPr>
+          <w:rFonts w:cs="Book Antiqua"/>
+          <w:b w:val="false"/>
+          <w:i w:val="false"/>
+        </w:rPr>
+        <w:t xml:space="preserve"> Provide clear feedback; apply authorised adjustments; reassess whether safe and meaningful participation remains achievable.</w:t>
       </w:r>
     </w:p>
     <w:p>
@@ -747,15 +747,15 @@
           <w:b/>
           <w:i w:val="false"/>
         </w:rPr>
-        <w:t>Decide and record</w:t>
-      </w:r>
-      <w:r>
-        <w:rPr>
-          <w:rFonts w:cs="Book Antiqua"/>
-          <w:b w:val="false"/>
-          <w:i w:val="false"/>
-        </w:rPr>
-        <w:t xml:space="preserve"> — if withdrawal remains necessary, staff provide observations and a recommendation to the designated uniformed authority.</w:t>
+        <w:t>Decide and record.</w:t>
+      </w:r>
+      <w:r>
+        <w:rPr>
+          <w:rFonts w:cs="Book Antiqua"/>
+          <w:b w:val="false"/>
+          <w:i w:val="false"/>
+        </w:rPr>
+        <w:t xml:space="preserve"> If withdrawal remains necessary, staff provide observations and a recommendation to the designated uniformed authority.</w:t>
       </w:r>
     </w:p>
     <w:p>

</xml_diff>

<commit_message>
Withdrawal SOP: restructure to three grounds by protected object
Grounds reduced from five to three, each protecting a different thing:
medical and safety (the individual), learning and assessment (the
learning environment), conduct (the safe and effective conduct of the
activity). Governing-principle conditions aligned to mirror the three
grounds. Visual model updated with protects-captions per ground.

Co-Authored-By: Claude Fable 5 <noreply@anthropic.com>
Claude-Session: https://claude.ai/code/session_01YLo1WfwUDkbwfJEF3ZNVbB
</commit_message>
<xml_diff>
--- a/output/withdrawal-sop.docx
+++ b/output/withdrawal-sop.docx
@@ -307,7 +307,7 @@
           <w:b w:val="false"/>
           <w:i w:val="false"/>
         </w:rPr>
-        <w:t>meaningful individual participation; or</w:t>
+        <w:t>the intended learning and assessment conditions; or</w:t>
       </w:r>
     </w:p>
     <w:p>
@@ -343,7 +343,7 @@
           <w:b w:val="false"/>
           <w:i w:val="false"/>
         </w:rPr>
-        <w:t>maintenance of learning and assessment conditions.</w:t>
+        <w:t>the safe and effective conduct of the activity.</w:t>
       </w:r>
     </w:p>
     <w:p>
@@ -363,6 +363,20 @@
           <w:sz w:val="24"/>
         </w:rPr>
         <w:t>3. Grounds for withdrawal</w:t>
+      </w:r>
+    </w:p>
+    <w:p>
+      <w:pPr>
+        <w:pStyle w:val="Normal"/>
+        <w:rPr/>
+      </w:pPr>
+      <w:r>
+        <w:rPr>
+          <w:rFonts w:cs="Book Antiqua"/>
+          <w:b w:val="false"/>
+          <w:i w:val="false"/>
+        </w:rPr>
+        <w:t>Each ground protects a different thing: the individual, the learning environment, and the activity itself.</w:t>
       </w:r>
     </w:p>
     <w:p>
@@ -390,15 +404,15 @@
           <w:b/>
           <w:i w:val="false"/>
         </w:rPr>
-        <w:t>Safety or medical risk.</w:t>
-      </w:r>
-      <w:r>
-        <w:rPr>
-          <w:rFonts w:cs="Book Antiqua"/>
-          <w:b w:val="false"/>
-          <w:i w:val="false"/>
-        </w:rPr>
-        <w:t xml:space="preserve"> Continued participation is unsafe or breaches an authorised medical restriction.</w:t>
+        <w:t>Medical and safety.</w:t>
+      </w:r>
+      <w:r>
+        <w:rPr>
+          <w:rFonts w:cs="Book Antiqua"/>
+          <w:b w:val="false"/>
+          <w:i w:val="false"/>
+        </w:rPr>
+        <w:t xml:space="preserve"> The participant cannot continue safely because of a medical condition or safety risk.</w:t>
       </w:r>
     </w:p>
     <w:p>
@@ -426,15 +440,15 @@
           <w:b/>
           <w:i w:val="false"/>
         </w:rPr>
-        <w:t>Physical participation.</w:t>
-      </w:r>
-      <w:r>
-        <w:rPr>
-          <w:rFonts w:cs="Book Antiqua"/>
-          <w:b w:val="false"/>
-          <w:i w:val="false"/>
-        </w:rPr>
-        <w:t xml:space="preserve"> The participant cannot safely undertake sufficient required activity despite reasonable adaptation.</w:t>
+        <w:t>Learning and assessment.</w:t>
+      </w:r>
+      <w:r>
+        <w:rPr>
+          <w:rFonts w:cs="Book Antiqua"/>
+          <w:b w:val="false"/>
+          <w:i w:val="false"/>
+        </w:rPr>
+        <w:t xml:space="preserve"> Continued participation by the participant prevents the activity from providing the intended learning and assessment conditions.</w:t>
       </w:r>
     </w:p>
     <w:p>
@@ -462,42 +476,6 @@
           <w:b/>
           <w:i w:val="false"/>
         </w:rPr>
-        <w:t>Learning and assessment validity.</w:t>
-      </w:r>
-      <w:r>
-        <w:rPr>
-          <w:rFonts w:cs="Book Antiqua"/>
-          <w:b w:val="false"/>
-          <w:i w:val="false"/>
-        </w:rPr>
-        <w:t xml:space="preserve"> The participant can no longer be meaningfully exposed to, develop against, or be assessed against approved objectives.</w:t>
-      </w:r>
-    </w:p>
-    <w:p>
-      <w:pPr>
-        <w:pStyle w:val="Normal"/>
-        <w:tabs>
-          <w:tab w:val="clear" w:pos="720"/>
-          <w:tab w:val="left" w:pos="397" w:leader="none"/>
-        </w:tabs>
-        <w:spacing w:before="60" w:after="40"/>
-        <w:ind w:hanging="397" w:left="397"/>
-        <w:rPr/>
-      </w:pPr>
-      <w:r>
-        <w:rPr>
-          <w:rFonts w:cs="Arial" w:ascii="Arial" w:hAnsi="Arial"/>
-          <w:b w:val="false"/>
-        </w:rPr>
-        <w:t>4.</w:t>
-        <w:tab/>
-      </w:r>
-      <w:r>
-        <w:rPr>
-          <w:rFonts w:cs="Book Antiqua"/>
-          <w:b/>
-          <w:i w:val="false"/>
-        </w:rPr>
         <w:t>Conduct.</w:t>
       </w:r>
       <w:r>
@@ -506,43 +484,7 @@
           <w:b w:val="false"/>
           <w:i w:val="false"/>
         </w:rPr>
-        <w:t xml:space="preserve"> Repeated refusal, deliberate non-compliance, or behaviour that creates risk or prevents team functioning after feedback.</w:t>
-      </w:r>
-    </w:p>
-    <w:p>
-      <w:pPr>
-        <w:pStyle w:val="Normal"/>
-        <w:tabs>
-          <w:tab w:val="clear" w:pos="720"/>
-          <w:tab w:val="left" w:pos="397" w:leader="none"/>
-        </w:tabs>
-        <w:spacing w:before="60" w:after="40"/>
-        <w:ind w:hanging="397" w:left="397"/>
-        <w:rPr/>
-      </w:pPr>
-      <w:r>
-        <w:rPr>
-          <w:rFonts w:cs="Arial" w:ascii="Arial" w:hAnsi="Arial"/>
-          <w:b w:val="false"/>
-        </w:rPr>
-        <w:t>5.</w:t>
-        <w:tab/>
-      </w:r>
-      <w:r>
-        <w:rPr>
-          <w:rFonts w:cs="Book Antiqua"/>
-          <w:b/>
-          <w:i w:val="false"/>
-        </w:rPr>
-        <w:t>Developmental welfare.</w:t>
-      </w:r>
-      <w:r>
-        <w:rPr>
-          <w:rFonts w:cs="Book Antiqua"/>
-          <w:b w:val="false"/>
-          <w:i w:val="false"/>
-        </w:rPr>
-        <w:t xml:space="preserve"> Continued participation is likely to cause harm and no longer provides meaningful developmental benefit.</w:t>
+        <w:t xml:space="preserve"> The participant refuses to follow lawful instructions or behaves in a way that prevents the safe and effective conduct of the activity.</w:t>
       </w:r>
     </w:p>
     <w:p>

</xml_diff>